<commit_message>
Preventivo: dati societari, cliente, pagamento e carta per Meta
Co-Authored-By: Claude Opus 5.5 <noreply@anthropic.com>
Claude-Session: https://claude.ai/code/session_01S38yLZb4PXeNtopihDvQvb
</commit_message>
<xml_diff>
--- a/preventivo/Preventivo_WsTech_WhatsApp_API.docx
+++ b/preventivo/Preventivo_WsTech_WhatsApp_API.docx
@@ -48,6 +48,7 @@
       </w:tblGrid>
       <w:tr>
         <w:trPr>
+          <w:cantSplit/>
           <w:tblHeader/>
         </w:trPr>
         <w:tc>
@@ -117,6 +118,7 @@
       </w:tr>
       <w:tr>
         <w:trPr>
+          <w:cantSplit/>
           <w:tblHeader w:val="false"/>
         </w:trPr>
         <w:tc>
@@ -193,13 +195,14 @@
                 <w:sz w:val="20"/>
                 <w:szCs w:val="20"/>
               </w:rPr>
-              <w:t xml:space="preserve">[Ragione sociale / Nome Cognome]</w:t>
+              <w:t xml:space="preserve">Vito Uggenti</w:t>
             </w:r>
           </w:p>
         </w:tc>
       </w:tr>
       <w:tr>
         <w:trPr>
+          <w:cantSplit/>
           <w:tblHeader w:val="false"/>
         </w:trPr>
         <w:tc>
@@ -285,6 +288,7 @@
       </w:tr>
       <w:tr>
         <w:trPr>
+          <w:cantSplit/>
           <w:tblHeader w:val="false"/>
         </w:trPr>
         <w:tc>
@@ -388,6 +392,7 @@
       </w:tr>
       <w:tr>
         <w:trPr>
+          <w:cantSplit/>
           <w:tblHeader w:val="false"/>
         </w:trPr>
         <w:tc>
@@ -783,7 +788,7 @@
           <w:sz w:val="20"/>
           <w:szCs w:val="20"/>
         </w:rPr>
-        <w:t xml:space="preserve">Collegamento del metodo di pagamento per i messaggi a consumo fatturati da Meta.</w:t>
+        <w:t xml:space="preserve">Collegamento a Meta della carta di pagamento che metterai a disposizione, per i messaggi a consumo.</w:t>
       </w:r>
     </w:p>
     <w:p>
@@ -1307,7 +1312,46 @@
           <w:sz w:val="20"/>
           <w:szCs w:val="20"/>
         </w:rPr>
-        <w:t xml:space="preserve">la lista contatti (Excel, CSV o esportazione dalla rubrica).</w:t>
+        <w:t xml:space="preserve">la lista contatti (Excel, CSV o esportazione dalla rubrica);</w:t>
+      </w:r>
+    </w:p>
+    <w:p>
+      <w:pPr>
+        <w:pStyle w:val="ListParagraph"/>
+        <w:numPr>
+          <w:ilvl w:val="0"/>
+          <w:numId w:val="3"/>
+        </w:numPr>
+        <w:spacing w:after="60" w:line="276"/>
+      </w:pPr>
+      <w:r>
+        <w:rPr>
+          <w:rFonts w:ascii="Century Gothic" w:cs="Century Gothic" w:eastAsia="Century Gothic" w:hAnsi="Century Gothic"/>
+          <w:color w:val="333333"/>
+          <w:sz w:val="20"/>
+          <w:szCs w:val="20"/>
+        </w:rPr>
+        <w:t xml:space="preserve">una </w:t>
+      </w:r>
+      <w:r>
+        <w:rPr>
+          <w:rFonts w:ascii="Century Gothic" w:cs="Century Gothic" w:eastAsia="Century Gothic" w:hAnsi="Century Gothic"/>
+          <w:b/>
+          <w:bCs/>
+          <w:color w:val="333333"/>
+          <w:sz w:val="20"/>
+          <w:szCs w:val="20"/>
+        </w:rPr>
+        <w:t xml:space="preserve">carta di credito o di debito</w:t>
+      </w:r>
+      <w:r>
+        <w:rPr>
+          <w:rFonts w:ascii="Century Gothic" w:cs="Century Gothic" w:eastAsia="Century Gothic" w:hAnsi="Century Gothic"/>
+          <w:color w:val="333333"/>
+          <w:sz w:val="20"/>
+          <w:szCs w:val="20"/>
+        </w:rPr>
+        <w:t xml:space="preserve"> da collegare a Meta, su cui verranno addebitati i messaggi inviati.</w:t>
       </w:r>
     </w:p>
     <w:p>
@@ -1403,6 +1447,7 @@
       </w:tblGrid>
       <w:tr>
         <w:trPr>
+          <w:cantSplit/>
           <w:tblHeader/>
         </w:trPr>
         <w:tc>
@@ -1504,6 +1549,7 @@
       </w:tr>
       <w:tr>
         <w:trPr>
+          <w:cantSplit/>
           <w:tblHeader w:val="false"/>
         </w:trPr>
         <w:tc>
@@ -1609,13 +1655,14 @@
                 <w:sz w:val="20"/>
                 <w:szCs w:val="20"/>
               </w:rPr>
-              <w:t xml:space="preserve">Ws Tech</w:t>
+              <w:t xml:space="preserve">Web System Technology S.r.l.</w:t>
             </w:r>
           </w:p>
         </w:tc>
       </w:tr>
       <w:tr>
         <w:trPr>
+          <w:cantSplit/>
           <w:tblHeader w:val="false"/>
         </w:trPr>
         <w:tc>
@@ -1711,6 +1758,7 @@
       </w:tr>
       <w:tr>
         <w:trPr>
+          <w:cantSplit/>
           <w:tblHeader w:val="false"/>
         </w:trPr>
         <w:tc>
@@ -1803,6 +1851,7 @@
       </w:tr>
       <w:tr>
         <w:trPr>
+          <w:cantSplit/>
           <w:tblHeader w:val="false"/>
         </w:trPr>
         <w:tc>
@@ -1891,7 +1940,7 @@
                 <w:sz w:val="20"/>
                 <w:szCs w:val="20"/>
               </w:rPr>
-              <w:t xml:space="preserve">Meta</w:t>
+              <w:t xml:space="preserve">Meta, con addebito sulla tua carta</w:t>
             </w:r>
           </w:p>
         </w:tc>
@@ -1938,7 +1987,27 @@
           <w:sz w:val="20"/>
           <w:szCs w:val="20"/>
         </w:rPr>
-        <w:t xml:space="preserve">Meta fa pagare ogni messaggio consegnato. Il prezzo dipende dal tipo di messaggio. Tariffe in vigore dal 1° luglio 2026, IVA esclusa:</w:t>
+        <w:t xml:space="preserve">Meta fa pagare ogni messaggio consegnato e addebita il costo direttamente sulla </w:t>
+      </w:r>
+      <w:r>
+        <w:rPr>
+          <w:rFonts w:ascii="Century Gothic" w:cs="Century Gothic" w:eastAsia="Century Gothic" w:hAnsi="Century Gothic"/>
+          <w:b/>
+          <w:bCs/>
+          <w:color w:val="333333"/>
+          <w:sz w:val="20"/>
+          <w:szCs w:val="20"/>
+        </w:rPr>
+        <w:t xml:space="preserve">carta di credito o di debito</w:t>
+      </w:r>
+      <w:r>
+        <w:rPr>
+          <w:rFonts w:ascii="Century Gothic" w:cs="Century Gothic" w:eastAsia="Century Gothic" w:hAnsi="Century Gothic"/>
+          <w:color w:val="333333"/>
+          <w:sz w:val="20"/>
+          <w:szCs w:val="20"/>
+        </w:rPr>
+        <w:t xml:space="preserve"> che metterai a disposizione e che collegheremo al tuo account Meta. Il prezzo dipende dal tipo di messaggio. Tariffe in vigore dal 1° luglio 2026, IVA esclusa:</w:t>
       </w:r>
     </w:p>
     <w:tbl>
@@ -1960,6 +2029,7 @@
       </w:tblGrid>
       <w:tr>
         <w:trPr>
+          <w:cantSplit/>
           <w:tblHeader/>
         </w:trPr>
         <w:tc>
@@ -2061,6 +2131,7 @@
       </w:tr>
       <w:tr>
         <w:trPr>
+          <w:cantSplit/>
           <w:tblHeader w:val="false"/>
         </w:trPr>
         <w:tc>
@@ -2173,6 +2244,7 @@
       </w:tr>
       <w:tr>
         <w:trPr>
+          <w:cantSplit/>
           <w:tblHeader w:val="false"/>
         </w:trPr>
         <w:tc>
@@ -2288,6 +2360,7 @@
       </w:tr>
       <w:tr>
         <w:trPr>
+          <w:cantSplit/>
           <w:tblHeader w:val="false"/>
         </w:trPr>
         <w:tc>
@@ -2400,6 +2473,7 @@
       </w:tr>
       <w:tr>
         <w:trPr>
+          <w:cantSplit/>
           <w:tblHeader w:val="false"/>
         </w:trPr>
         <w:tc>
@@ -2626,7 +2700,7 @@
           <w:sz w:val="20"/>
           <w:szCs w:val="20"/>
         </w:rPr>
-        <w:t xml:space="preserve">Pagamento: [da definire, es. 50% all'accettazione e 50% alla consegna].</w:t>
+        <w:t xml:space="preserve">Pagamento: 50% all'accettazione del preventivo e 50% alla consegna.</w:t>
       </w:r>
     </w:p>
     <w:p>
@@ -2806,19 +2880,33 @@
         <w:b/>
         <w:bCs/>
         <w:color w:val="6599CD"/>
-        <w:sz w:val="16"/>
-        <w:szCs w:val="16"/>
+        <w:sz w:val="15"/>
+        <w:szCs w:val="15"/>
       </w:rPr>
-      <w:t xml:space="preserve">Ws Tech</w:t>
+      <w:t xml:space="preserve">WEB SYSTEM TECHNOLOGY S.R.L.</w:t>
     </w:r>
     <w:r>
       <w:rPr>
         <w:rFonts w:ascii="Century Gothic" w:cs="Century Gothic" w:eastAsia="Century Gothic" w:hAnsi="Century Gothic"/>
         <w:color w:val="999999"/>
-        <w:sz w:val="16"/>
-        <w:szCs w:val="16"/>
+        <w:sz w:val="15"/>
+        <w:szCs w:val="15"/>
       </w:rPr>
-      <w:t xml:space="preserve">  ·  [Indirizzo]  ·  P.IVA [__________]  ·  [email]  ·  [telefono]</w:t>
+      <w:t xml:space="preserve">  ·  Via Cesare Terranova 74 - 03100 Frosinone (FR)</w:t>
+    </w:r>
+  </w:p>
+  <w:p>
+    <w:pPr>
+      <w:jc w:val="center"/>
+    </w:pPr>
+    <w:r>
+      <w:rPr>
+        <w:rFonts w:ascii="Century Gothic" w:cs="Century Gothic" w:eastAsia="Century Gothic" w:hAnsi="Century Gothic"/>
+        <w:color w:val="999999"/>
+        <w:sz w:val="15"/>
+        <w:szCs w:val="15"/>
+      </w:rPr>
+      <w:t xml:space="preserve">P.IVA e C.F. 02664400609  ·  VAT IT02664400609</w:t>
     </w:r>
   </w:p>
   <w:p>

</xml_diff>